<commit_message>
Add proper thick borders and real reference fields to all templates
Reviewed the actual Word/Excel reference templates (not just the PDFs
checked earlier) and found two real gaps: our borders were too thin/
subtle compared to the fill-in-form convention real quotation templates
use, and we were missing fields present in every reference sample
(Description of Work section, SGST/CGST split instead of flat GST,
Amount in Words, a Discount line).

- PDF: Bold/Formal/Compact themes now use a visible GRID border around
  every cell (Minimal intentionally keeps its thin-rule look, as the
  one deliberately understated option among four).
- Word/Excel: full thick-bordered boxes throughout, Description of Work
  field added, GST split into SGST+CGST (matches real Indian
  convention), Discount line and Amount in Words field added.
- Regenerated all 6 gallery thumbnails from the updated files.

Co-Authored-By: Claude Sonnet 5 <noreply@anthropic.com>
</commit_message>
<xml_diff>
--- a/assets/templates/billbolo-quotation-format.docx
+++ b/assets/templates/billbolo-quotation-format.docx
@@ -5,7 +5,6 @@
     <w:tbl>
       <w:tblPr>
         <w:tblW w:type="auto" w:w="0"/>
-        <w:tblLayout w:type="autofit"/>
         <w:tblLook w:firstColumn="1" w:firstRow="1" w:lastColumn="0" w:lastRow="0" w:noHBand="0" w:noVBand="1" w:val="04A0"/>
       </w:tblPr>
       <w:tblGrid>
@@ -31,7 +30,11 @@
                 <w:sz w:val="18"/>
               </w:rPr>
               <w:br/>
+              <w:t>[Address]</w:t>
+              <w:br/>
               <w:t>[Your Phone Number]   [Your Email]</w:t>
+              <w:br/>
+              <w:t>GSTIN: [Your GSTIN]</w:t>
             </w:r>
           </w:p>
         </w:tc>
@@ -69,6 +72,14 @@
       <w:tblPr>
         <w:tblW w:type="auto" w:w="0"/>
         <w:tblLook w:firstColumn="1" w:firstRow="1" w:lastColumn="0" w:lastRow="0" w:noHBand="0" w:noVBand="1" w:val="04A0"/>
+        <w:tblBorders>
+          <w:top w:val="single" w:sz="18" w:space="0" w:color="0F172A"/>
+          <w:left w:val="single" w:sz="18" w:space="0" w:color="0F172A"/>
+          <w:bottom w:val="single" w:sz="18" w:space="0" w:color="0F172A"/>
+          <w:right w:val="single" w:sz="18" w:space="0" w:color="0F172A"/>
+          <w:insideH w:val="single" w:sz="18" w:space="0" w:color="0F172A"/>
+          <w:insideV w:val="single" w:sz="18" w:space="0" w:color="0F172A"/>
+        </w:tblBorders>
       </w:tblPr>
       <w:tblGrid>
         <w:gridCol w:w="5112"/>
@@ -77,22 +88,58 @@
       <w:tr>
         <w:tc>
           <w:tcPr>
-            <w:tcW w:type="dxa" w:w="5112"/>
+            <w:tcW w:type="dxa" w:w="10224"/>
+            <w:gridSpan w:val="2"/>
+            <w:shd w:fill="0284C7"/>
+          </w:tcPr>
+          <w:p>
+            <w:r>
+              <w:rPr>
+                <w:b/>
+                <w:color w:val="FFFFFF"/>
+              </w:rPr>
+              <w:t>BILL TO</w:t>
+            </w:r>
+          </w:p>
+        </w:tc>
+      </w:tr>
+      <w:tr>
+        <w:tc>
+          <w:tcPr>
+            <w:tcW w:type="dxa" w:w="10224"/>
+            <w:gridSpan w:val="2"/>
           </w:tcPr>
           <w:p>
             <w:r>
               <w:rPr>
                 <w:b/>
               </w:rPr>
-              <w:t>BILL TO</w:t>
-              <w:br/>
+              <w:t>[Client Name]</w:t>
             </w:r>
+          </w:p>
+        </w:tc>
+      </w:tr>
+      <w:tr>
+        <w:tc>
+          <w:tcPr>
+            <w:tcW w:type="dxa" w:w="10224"/>
+            <w:gridSpan w:val="2"/>
+          </w:tcPr>
+          <w:p>
             <w:r>
-              <w:t>[Client Name]</w:t>
-              <w:br/>
               <w:t>[Client Address]</w:t>
-              <w:br/>
-              <w:t>[Client Phone]</w:t>
+            </w:r>
+          </w:p>
+        </w:tc>
+      </w:tr>
+      <w:tr>
+        <w:tc>
+          <w:tcPr>
+            <w:tcW w:type="dxa" w:w="5112"/>
+          </w:tcPr>
+          <w:p>
+            <w:r>
+              <w:t>GSTIN: [Client GSTIN, if applicable]</w:t>
             </w:r>
           </w:p>
         </w:tc>
@@ -105,14 +152,7 @@
               <w:jc w:val="right"/>
             </w:pPr>
             <w:r>
-              <w:rPr>
-                <w:b/>
-              </w:rPr>
-              <w:t>VALID UNTIL</w:t>
-              <w:br/>
-            </w:r>
-            <w:r>
-              <w:t>[DD/MM/YYYY]</w:t>
+              <w:t>Valid Until: [DD/MM/YYYY]</w:t>
             </w:r>
           </w:p>
         </w:tc>
@@ -121,9 +161,64 @@
     <w:p/>
     <w:tbl>
       <w:tblPr>
-        <w:tblStyle w:val="TableGrid"/>
         <w:tblW w:type="auto" w:w="0"/>
         <w:tblLook w:firstColumn="1" w:firstRow="1" w:lastColumn="0" w:lastRow="0" w:noHBand="0" w:noVBand="1" w:val="04A0"/>
+        <w:tblBorders>
+          <w:top w:val="single" w:sz="18" w:space="0" w:color="0F172A"/>
+          <w:left w:val="single" w:sz="18" w:space="0" w:color="0F172A"/>
+          <w:bottom w:val="single" w:sz="18" w:space="0" w:color="0F172A"/>
+          <w:right w:val="single" w:sz="18" w:space="0" w:color="0F172A"/>
+          <w:insideH w:val="single" w:sz="18" w:space="0" w:color="0F172A"/>
+          <w:insideV w:val="single" w:sz="18" w:space="0" w:color="0F172A"/>
+        </w:tblBorders>
+      </w:tblPr>
+      <w:tblGrid>
+        <w:gridCol w:w="10224"/>
+      </w:tblGrid>
+      <w:tr>
+        <w:tc>
+          <w:tcPr>
+            <w:tcW w:type="dxa" w:w="10224"/>
+            <w:shd w:fill="0284C7"/>
+          </w:tcPr>
+          <w:p>
+            <w:r>
+              <w:rPr>
+                <w:b/>
+                <w:color w:val="FFFFFF"/>
+              </w:rPr>
+              <w:t>DESCRIPTION OF WORK</w:t>
+            </w:r>
+          </w:p>
+        </w:tc>
+      </w:tr>
+      <w:tr>
+        <w:trPr>
+          <w:trHeight w:val="720"/>
+        </w:trPr>
+        <w:tc>
+          <w:tcPr>
+            <w:tcW w:type="dxa" w:w="10224"/>
+          </w:tcPr>
+          <w:p>
+            <w:r/>
+          </w:p>
+        </w:tc>
+      </w:tr>
+    </w:tbl>
+    <w:p/>
+    <w:tbl>
+      <w:tblPr>
+        <w:tblW w:type="auto" w:w="0"/>
+        <w:tblLook w:firstColumn="1" w:firstRow="1" w:lastColumn="0" w:lastRow="0" w:noHBand="0" w:noVBand="1" w:val="04A0"/>
+        <w:tblBorders>
+          <w:top w:val="single" w:sz="18" w:space="0" w:color="0F172A"/>
+          <w:left w:val="single" w:sz="18" w:space="0" w:color="0F172A"/>
+          <w:bottom w:val="single" w:sz="18" w:space="0" w:color="0F172A"/>
+          <w:right w:val="single" w:sz="18" w:space="0" w:color="0F172A"/>
+          <w:insideH w:val="single" w:sz="18" w:space="0" w:color="0F172A"/>
+          <w:insideV w:val="single" w:sz="18" w:space="0" w:color="0F172A"/>
+        </w:tblBorders>
       </w:tblPr>
       <w:tblGrid>
         <w:gridCol w:w="2045"/>
@@ -430,6 +525,14 @@
       <w:tblPr>
         <w:tblW w:type="auto" w:w="0"/>
         <w:tblLook w:firstColumn="1" w:firstRow="1" w:lastColumn="0" w:lastRow="0" w:noHBand="0" w:noVBand="1" w:val="04A0"/>
+        <w:tblBorders>
+          <w:top w:val="single" w:sz="18" w:space="0" w:color="0F172A"/>
+          <w:left w:val="single" w:sz="18" w:space="0" w:color="0F172A"/>
+          <w:bottom w:val="single" w:sz="18" w:space="0" w:color="0F172A"/>
+          <w:right w:val="single" w:sz="18" w:space="0" w:color="0F172A"/>
+          <w:insideH w:val="single" w:sz="18" w:space="0" w:color="0F172A"/>
+          <w:insideV w:val="single" w:sz="18" w:space="0" w:color="0F172A"/>
+        </w:tblBorders>
       </w:tblPr>
       <w:tblGrid>
         <w:gridCol w:w="5112"/>
@@ -473,7 +576,7 @@
               <w:jc w:val="right"/>
             </w:pPr>
             <w:r>
-              <w:t>GST @ 18%</w:t>
+              <w:t>SGST @ 9%</w:t>
             </w:r>
           </w:p>
         </w:tc>
@@ -501,6 +604,35 @@
               <w:jc w:val="right"/>
             </w:pPr>
             <w:r>
+              <w:t>CGST @ 9%</w:t>
+            </w:r>
+          </w:p>
+        </w:tc>
+        <w:tc>
+          <w:tcPr>
+            <w:tcW w:type="dxa" w:w="5112"/>
+          </w:tcPr>
+          <w:p>
+            <w:pPr>
+              <w:jc w:val="right"/>
+            </w:pPr>
+            <w:r>
+              <w:t>Rs. 0.00</w:t>
+            </w:r>
+          </w:p>
+        </w:tc>
+      </w:tr>
+      <w:tr>
+        <w:tc>
+          <w:tcPr>
+            <w:tcW w:type="dxa" w:w="5112"/>
+            <w:shd w:fill="F0F9FF"/>
+          </w:tcPr>
+          <w:p>
+            <w:pPr>
+              <w:jc w:val="right"/>
+            </w:pPr>
+            <w:r>
               <w:rPr>
                 <w:b/>
                 <w:color w:val="0284C7"/>
@@ -512,6 +644,7 @@
         <w:tc>
           <w:tcPr>
             <w:tcW w:type="dxa" w:w="5112"/>
+            <w:shd w:fill="F0F9FF"/>
           </w:tcPr>
           <w:p>
             <w:pPr>
@@ -528,6 +661,18 @@
         </w:tc>
       </w:tr>
     </w:tbl>
+    <w:p/>
+    <w:p>
+      <w:r>
+        <w:rPr>
+          <w:b/>
+        </w:rPr>
+        <w:t xml:space="preserve">Amount in Words: </w:t>
+      </w:r>
+      <w:r>
+        <w:t>[Rupees ... Only]</w:t>
+      </w:r>
+    </w:p>
     <w:p/>
     <w:p>
       <w:r>

</xml_diff>